<commit_message>
Sync humanized prose to Chinese v5: 6 of 10 edits ported (4 already natural in Chinese), rebuild + anchor checks pass
</commit_message>
<xml_diff>
--- a/paper/猪行为检测-中文成稿-v5.docx
+++ b/paper/猪行为检测-中文成稿-v5.docx
@@ -31,7 +31,7 @@
         <w:rPr>
           <w:i w:val="0"/>
         </w:rPr>
-        <w:t>群养猪的自动化行为监测，要求检测模型既能识别稀有但关乎福利的行为，又能在低成本边缘硬件上实时运行。本文基于 YOLOv11n 构建了一套实时多行为检测框架，并在 Jetson Nano 上完成部署验证。三项工作让这套框架真正可用：其一，类别不均衡感知采样策略（频率封顶的离线过采样），不改网络即提升稀有类检测——低频行为active 的 AP 在测试集上从 0.526 提升至 0.639，总体召回率在验证集上提高 2.1 个百分点；其二，FasterNet 轻量化主干替换配合"恒等保持"预训练权重迁移策略，参数量降低 4.4%，三次重复实验中精度与基线统计相当（test mAP50 0.590±0.009 对三种子基线 0.606±0.008），且推理速度为所有参评模型最快（RTX 3090 上 117.6 FPS）；其三，Jetson Nano 实测验证实时性（640×640 输入 19.7 FPS、480×480 输入 33.3 FPS、整机功耗约 5W），并通过两级泛化分析（未见序列压力测试与独立农场数据集）如实划定框架的适用边界。</w:t>
+        <w:t>群养猪的自动化行为监测，要求检测模型既能识别稀有但关乎福利的行为，又能在低成本边缘硬件上实时运行。本文基于 YOLOv11n 构建了一套实时多行为检测框架，并在 Jetson Nano 上完成部署验证，三项设计选择支撑起最终结果：其一，类别不均衡感知采样策略（频率封顶的离线过采样），不改网络即提升稀有类检测——低频行为 active 的 AP 在测试集上从 0.526 提升至 0.639，总体召回率在验证集上提高 2.1 个百分点；其二，FasterNet 轻量化主干替换配合"恒等保持"预训练权重迁移策略，参数量降低 4.4%，三次重复实验中精度与基线统计相当（test mAP50 0.590±0.009 对三种子基线 0.606±0.008），且出人意料地是全部参评模型中最快的（RTX 3090 上 117.6 FPS）；其三，Jetson Nano 实测验证实时性（640×640 输入 19.7 FPS、480×480 输入 33.3 FPS、整机功耗约 5W）。两级泛化分析（未见序列压力测试与独立农场数据集）则为整套研究收束闭环：划清框架在何处有效、何处失效。</w:t>
       </w:r>
     </w:p>
     <w:p>
@@ -63,7 +63,7 @@
         <w:rPr>
           <w:i w:val="0"/>
         </w:rPr>
-        <w:t>但监测要在经济账上成立，检测就必须跑在猪舍内的廉价边缘设备上。一个商业猪场可能有上百个栏位，把所有视频流上传云端，在农村网络条件下既不现实，云推理的持续开销也远超边缘板卡的一次性投入。延迟同样关键：一条迟到几分钟的打斗警报几乎没有价值。这就是为什么工程上的主流趋势是把检测器带到数据旁边，而不是反过来。</w:t>
+        <w:t>但监测要在经济账上成立，检测就必须跑在猪舍内的廉价边缘设备上。一个商业猪场可能有上百个栏位，把所有视频流上传云端，在农村网络条件下既不现实，云推理的持续开销也远超边缘板卡的一次性投入。延迟同样关键：一条迟到几分钟的打斗警报几乎没有价值。工程趋势因此只有一个方向——把检测器带到数据旁边，而不是反过来。</w:t>
       </w:r>
     </w:p>
     <w:p>
@@ -1085,7 +1085,7 @@
         <w:rPr>
           <w:i w:val="0"/>
         </w:rPr>
-        <w:t>表 3 按我们实际探索的顺序走过整个设计空间，包括失败。两次注意力集成尝试（M1、M2）列在最前：两者都明显损伤精度，而其诊断（3.5 节）正是我们转向恒等保持集成的原因。FasterNet 单独替换（M3）以 4.4% 参数削减为代价损失 2.7 个 test 点；热重启续训实验（100+100 轮、lr0=0.002）追回 2.95 点，说明差距部分是替换块欠训的产物而非容量天花板。采样策略单独使用（M4）是最有效的单一改动：test mAP50 由 0.5964 升至 0.6035，验证集召回由 0.605 升至 0.626（+2.1 点，验证集），增益集中在稀有类（4.4 节；训练动态见图 3）。组合模型（M5）达到 0.5932——与基线仅差 0.32 点——同时参数少 4.4%，也是第 5 节部署的模型。最后，阴性对照（M6）把同一采样策略施加于 YOLOv12n：精度由 0.6135 降至 0.5994（-1.4 点），即曝光再平衡的收益无法迁移到注意力中心基座。我们将其读作 YOLOv12n 原生抗不均衡更强、重采样反而致其过拟合的证据；它也回溯性地印证了我们在这一"数据集+方法"组合下选择 YOLOv11n 作基座的经验判断。</w:t>
+        <w:t>表 3 按我们实际探索的顺序走过整个设计空间，包括失败。两次注意力集成尝试（M1、M2）列在最前：两者都明显损伤精度，而其诊断（3.5 节）正是我们转向恒等保持集成的原因。FasterNet 单独替换（M3）以 4.4% 参数削减为代价损失 2.7 个 test 点；热重启续训实验（100+100 轮、lr0=0.002）追回 2.95 点，说明差距部分是替换块欠训的产物而非容量天花板。采样策略单独使用（M4）是最有效的单一改动：test mAP50 由 0.5964 升至 0.6035，验证集召回由 0.605 升至 0.626（+2.1 点，验证集），增益集中在稀有类（4.4 节；训练动态见图 3）。组合模型（M5）达到 0.5932——与基线仅差 0.32 点——同时参数少 4.4%，也是第 5 节部署的模型。最后，阴性对照（M6）把同一采样策略施加于 YOLOv12n：精度由 0.6135 降至 0.5994（-1.4 点），即曝光再平衡的收益无法迁移到注意力中心基座。我们将其读作 YOLOv12n 原生抗不均衡更强、重采样反而致其过拟合的证据；它也回溯性地支持了我们在这一"数据集+方法"组合下选择 YOLOv11n 作基座的经验判断。</w:t>
       </w:r>
     </w:p>
     <w:p>
@@ -1667,7 +1667,7 @@
         <w:rPr>
           <w:i w:val="0"/>
         </w:rPr>
-        <w:t>表 4 在相同训练条件下对比两个采用变体与对照组。M4（0.6035）超过 YOLOv5n（0.6001）、RT-DETR-l（0.6008）、YOLOv8n（0.5877）与未改动的 YOLOv11n 基线（0.5964），仅次于 YOLOv12n（0.6135）。M5 以 2.47M 参数达到 0.5932：比 YOLOv8n 小 18% 仍反超，并逼近 RT-DETR-l——参数量约为其 1/13、FLOPs 约为其 1/16；当目标硬件是 5 瓦边缘板而非服务器 GPU 时，这是一个有实际意义的工作点。两个现象值得记录：其一，YOLOv8n 在验证集上高于我们基线、在测试集上反而更低——验证集排名并不总能挺过留出数据的检验；其二，YOLOv12n 虽是本数据集精度王，却也是我们实测最慢的模型（4.6 节），且如 M6 所示并不受益于采样策略——对边缘导向的框架而言，我们把它视为强力的服务器端参照，而非部署候选。</w:t>
+        <w:t>表 4 在相同训练条件下对比两个采用变体与对照组。M4（0.6035）超过 YOLOv5n（0.6001）、RT-DETR-l（0.6008）、YOLOv8n（0.5877）与未改动的 YOLOv11n 基线（0.5964），仅次于 YOLOv12n（0.6135）。M5 以 2.47M 参数达到 0.5932：比 YOLOv8n 小 18% 仍反超，并逼近 RT-DETR-l——参数量约为其 1/13、FLOPs 约为其 1/16；当目标硬件是 5 瓦边缘板而非服务器 GPU 时，这是一个有实际意义的工作点。两个现象尤为突出：其一，YOLOv8n 在验证集上高于我们基线、在测试集上反而更低——验证集排名并不总能挺过留出数据的检验；其二，YOLOv12n 虽是本数据集精度王，却也是我们实测最慢的模型（4.6 节），且如 M6 所示并不受益于采样策略——对边缘导向的框架而言，我们把它视为强力的服务器端参照，而非部署候选。</w:t>
       </w:r>
     </w:p>
     <w:p>
@@ -2137,7 +2137,7 @@
         <w:rPr>
           <w:i w:val="0"/>
         </w:rPr>
-        <w:t>小型检测器单次训练的波动轻易可达半个百分点，因此基线与两个采用模型都以三个不同种子重复。基线验证集 0.5822±0.0087、测试集 0.6060±0.0084（种子 0 精确复现表 3 所报的 0.5964 单次实验）。M4 验证集 0.5790±0.0054、测试集 0.5987±0.0062；M5 分别为 0.5620±0.0079 与 0.5904±0.0086。相对三种子基线 test 均值，M5 的差值（-0.016）约相当于种子间变异的两个标准误，在 0.05 水平不显著（双样本 t 检验，p≈0.09），故我们将 M5 的精度表述为与基线统计相当而非超越。M4 的 test 均值落在基线一个标准差以内（-0.007）——其真正价值如 4.4 节所示，在于精度向稀有的福利相关行为再分配，以及验证集 +2.1 点的召回增益，而非整体 mAP 上涨。我们刻意这样呈现："整体提升"的框架经不起审稿人推敲，而稀有类框架既诚实，对福利预警又恰是实际相关的那个。</w:t>
+        <w:t>小型检测器单次训练的波动轻易可达半个百分点，因此基线与两个采用模型都以三个不同种子重复。基线验证集 0.5822±0.0087、测试集 0.6060±0.0084（种子 0 精确复现表 3 所报的 0.5964 单次实验）。M4 验证集 0.5790±0.0054、测试集 0.5987±0.0062；M5 分别为 0.5620±0.0079 与 0.5904±0.0086。相对三种子基线 test 均值，M5 的差值（-0.016）约相当于种子间变异的两个标准误，在 0.05 水平不显著（双样本 t 检验，p≈0.09），故我们将 M5 的精度表述为与基线统计相当而非超越。M4 的 test 均值落在基线一个标准差以内（-0.007）——其真正价值如 4.4 节所示，在于精度向稀有的福利相关行为再分配，以及验证集 +2.1 点的召回增益，而非整体 mAP 上涨。我们刻意这样呈现："整体提升"的框架会夸大证据，而稀有类框架既诚实，对福利预警又恰是实际相关的那个。</w:t>
       </w:r>
     </w:p>
     <w:p>
@@ -3177,7 +3177,7 @@
         <w:rPr>
           <w:i w:val="0"/>
         </w:rPr>
-        <w:t>本文提出了一个轻量化、实时的群养猪多行为检测框架，将类别不均衡感知采样与 FasterNet 主干替换在"恒等保持"集成策略下结合。在公开的十类行为数据集上，框架将低频行为（active）的 AP 在独立测试集上提升 11.3 点、验证集召回提升 2.1 点；三次重复实验中整体精度与 YOLOv11n 基线统计相当；参数量减少 4.4%；在服务器 GPU 上是所有参评模型中最快的（117.6 FPS）。Jetson Nano 上板验证确认实时运行（640×640 下 19.7 FPS、480×480 下 33.3 FPS），整机功耗约 5W。两级泛化分析——未见序列压力测试与独立农场数据集零样本评估——诚实地划定了适用边界：框架今天即可用于同农场部署；域适应与多农场数据采集则是明天跨农场运行的关键方向。</w:t>
+        <w:t>本文提出了一个轻量化、实时的群养猪多行为检测框架，将类别不均衡感知采样与 FasterNet 主干替换在"恒等保持"集成策略下结合。在公开的十类行为数据集上，框架将低频行为（active）的 AP 在独立测试集上提升 11.3 点、验证集召回提升 2.1 点；三次重复实验中整体精度与 YOLOv11n 基线统计相当；参数量减少 4.4%；在服务器 GPU 上是所有参评模型中最快的（117.6 FPS）。Jetson Nano 上板验证确认实时运行（640×640 下 19.7 FPS、480×480 下 33.3 FPS），整机功耗约 5W。两级泛化分析——未见序列压力测试与独立农场数据集零样本评估——不加粉饰地划出了适用边界：框架今天即可用于同农场部署；域适应与多农场数据采集则是明天跨农场运行的关键方向。</w:t>
       </w:r>
     </w:p>
     <w:p>

</xml_diff>

<commit_message>
Chinese manuscript: author names in Chinese characters (张展/勾林林)
</commit_message>
<xml_diff>
--- a/paper/猪行为检测-中文成稿-v5.docx
+++ b/paper/猪行为检测-中文成稿-v5.docx
@@ -15,7 +15,7 @@
         <w:rPr>
           <w:i w:val="0"/>
         </w:rPr>
-        <w:t>Zhan Zhang†*，Linlin Gou†</w:t>
+        <w:t>张展†*，勾林林†</w:t>
       </w:r>
     </w:p>
     <w:p>
@@ -23,7 +23,7 @@
         <w:rPr>
           <w:i/>
         </w:rPr>
-        <w:t>† 共同一作（贡献相同）｜六盘水师范学院 生物科学与技术学院，贵州 六盘水 553000｜*通讯作者：Zhan Zhang，邮箱：851709772@qq.com</w:t>
+        <w:t>† 共同一作（贡献相同）｜六盘水师范学院 生物科学与技术学院，贵州 六盘水 553000｜*通讯作者：张展，邮箱：851709772@qq.com</w:t>
       </w:r>
     </w:p>
     <w:p>

</xml_diff>